<commit_message>
Registry mojibake fix (L41 prompts) + L41 packet rebuild
Adds fix_registry_mojibake.py — runs ftfy.fix_text over every prompt
and answer in questionbank/registry.jsonl. Fixed 12 L41 rows where
em-dashes had landed as `â€”` and the multiplication sign had landed
as `Ã—`. The ice-cube Try-It 3 prompt's `20Â°C` is now `20°C`. The
docx and LaTeX outputs both render the clean character.

Backs up to registry.jsonl.bak and gitignores it.

Re-ran build_L41_P{1,2,3}_packets.py to refresh the docx outputs.
Other lessons untouched (no L35/L43/L44/L45/L51/L54/L55/L63/L64/L65
items had mojibake).

Co-Authored-By: Claude Opus 4.7 (1M context) <noreply@anthropic.com>
</commit_message>
<xml_diff>
--- a/L41_P2_Student_Packet.docx
+++ b/L41_P2_Student_Packet.docx
@@ -447,7 +447,7 @@
         <w:rPr>
           <w:sz w:val="22"/>
         </w:rPr>
-        <w:t>Try It 3. The amount of time it takes for an ice cube to melt varies inversely with the air temperature in degrees Celsius. At 20Â°C, the ice will melt in 20 minutes. How long will it take the ice to melt if the temperature is 30Â°C?</w:t>
+        <w:t>Try It 3. The amount of time it takes for an ice cube to melt varies inversely with the air temperature in degrees Celsius. At 20°C, the ice will melt in 20 minutes. How long will it take the ice to melt if the temperature is 30°C?</w:t>
       </w:r>
     </w:p>
     <w:p>
@@ -516,7 +516,7 @@
         <w:rPr>
           <w:sz w:val="22"/>
         </w:rPr>
-        <w:t>23. Model With Mathematics: Boyle's Law states that the pressure exerted by fixed quantity of a gas, P, varies inversely with the volume the gas occupies, V, assuming constant temperature. The volume and air pressure of a volleyball are 300 in^3 and 4.5 psi. The volume and air pressure of a basketball are 415 in^3 and 8 psi. How much smaller would the volleyball have to be to be equal the air pressure of the basketball?</w:t>
+        <w:t>23. Model With Mathematics: Boyle's Law states that the pressure exerted by fixed quantity of a gas, P, varies inversely with the volume the gas occupies, V, assuming constant temperature. The volume and air pressure of a volleyball are 300 in³ and 4.5 psi. The volume and air pressure of a basketball are 415 in³ and 8 psi. How much smaller would the volleyball have to be to be equal the air pressure of the basketball?</w:t>
       </w:r>
     </w:p>
     <w:p>

</xml_diff>